<commit_message>
Fix build script to install backend dependencies
The Railway deploy crashed because the build script only installed
scm-app deps. Now installs scm-api deps first.

Co-Authored-By: Claude Opus 4.6 <noreply@anthropic.com>
</commit_message>
<xml_diff>
--- a/scm-app/project_knowledge/SCM_Teknik_Spesifikasyon_v1.docx
+++ b/scm-app/project_knowledge/SCM_Teknik_Spesifikasyon_v1.docx
@@ -13562,21 +13562,24 @@
         <w:spacing w:before="240" w:line="320" w:lineRule="exact"/>
         <w:rPr>
           <w:ins w:id="354" w:author="Tamer Sezgin" w:date="2026-03-10T12:54:00Z" w16du:dateUtc="2026-03-10T12:54:10Z"/>
+          <w:del w:id="355" w:author="Toygun Baysal" w:date="2026-03-17T11:37:00Z" w16du:dateUtc="2026-03-17T08:37:00Z"/>
           <w:rFonts w:ascii="Cambria" w:eastAsia="Cambria" w:hAnsi="Cambria" w:cs="Cambria"/>
         </w:rPr>
-        <w:pPrChange w:id="355" w:author="Tamer Sezgin" w:date="2026-03-10T12:54:00Z">
+        <w:pPrChange w:id="356" w:author="Tamer Sezgin" w:date="2026-03-10T12:54:00Z">
           <w:pPr/>
         </w:pPrChange>
       </w:pPr>
-      <w:ins w:id="356" w:author="Tamer Sezgin" w:date="2026-03-10T12:54:00Z" w16du:dateUtc="2026-03-10T12:54:10Z">
-        <w:r>
-          <w:rPr>
-            <w:rFonts w:ascii="Cambria" w:eastAsia="Cambria" w:hAnsi="Cambria" w:cs="Cambria"/>
-            <w:sz w:val="24"/>
-            <w:szCs w:val="24"/>
-          </w:rPr>
-          <w:t>Manuel aksiyon raporu</w:t>
-        </w:r>
+      <w:ins w:id="357" w:author="Tamer Sezgin" w:date="2026-03-10T12:54:00Z" w16du:dateUtc="2026-03-10T12:54:10Z">
+        <w:del w:id="358" w:author="Toygun Baysal" w:date="2026-03-17T11:37:00Z" w16du:dateUtc="2026-03-17T08:37:00Z">
+          <w:r>
+            <w:rPr>
+              <w:rFonts w:ascii="Cambria" w:eastAsia="Cambria" w:hAnsi="Cambria" w:cs="Cambria"/>
+              <w:sz w:val="24"/>
+              <w:szCs w:val="24"/>
+            </w:rPr>
+            <w:delText>Manuel aksiyon raporu</w:delText>
+          </w:r>
+        </w:del>
       </w:ins>
     </w:p>
     <w:p>
@@ -13588,9 +13591,10 @@
         </w:numPr>
         <w:spacing w:line="320" w:lineRule="exact"/>
         <w:rPr>
+          <w:del w:id="359" w:author="Toygun Baysal" w:date="2026-03-17T11:37:00Z" w16du:dateUtc="2026-03-17T08:37:00Z"/>
           <w:rFonts w:ascii="Cambria" w:eastAsia="Cambria" w:hAnsi="Cambria" w:cs="Cambria"/>
         </w:rPr>
-        <w:pPrChange w:id="357" w:author="Tamer Sezgin" w:date="2026-03-10T12:54:00Z">
+        <w:pPrChange w:id="360" w:author="Tamer Sezgin" w:date="2026-03-10T12:54:00Z">
           <w:pPr>
             <w:numPr>
               <w:numId w:val="10"/>
@@ -13599,15 +13603,17 @@
           </w:pPr>
         </w:pPrChange>
       </w:pPr>
-      <w:ins w:id="358" w:author="Tamer Sezgin" w:date="2026-03-10T12:54:00Z" w16du:dateUtc="2026-03-10T12:54:10Z">
-        <w:r>
-          <w:rPr>
-            <w:rFonts w:ascii="Cambria" w:eastAsia="Cambria" w:hAnsi="Cambria" w:cs="Cambria"/>
-            <w:sz w:val="24"/>
-            <w:szCs w:val="24"/>
-          </w:rPr>
-          <w:t>Manuel rapor oluşturma</w:t>
-        </w:r>
+      <w:ins w:id="361" w:author="Tamer Sezgin" w:date="2026-03-10T12:54:00Z" w16du:dateUtc="2026-03-10T12:54:10Z">
+        <w:del w:id="362" w:author="Toygun Baysal" w:date="2026-03-17T11:37:00Z" w16du:dateUtc="2026-03-17T08:37:00Z">
+          <w:r>
+            <w:rPr>
+              <w:rFonts w:ascii="Cambria" w:eastAsia="Cambria" w:hAnsi="Cambria" w:cs="Cambria"/>
+              <w:sz w:val="24"/>
+              <w:szCs w:val="24"/>
+            </w:rPr>
+            <w:delText>Manuel rapor oluşturma</w:delText>
+          </w:r>
+        </w:del>
       </w:ins>
     </w:p>
     <w:p>
@@ -13617,7 +13623,7 @@
           <w:lang w:val="tr-TR"/>
         </w:rPr>
       </w:pPr>
-      <w:bookmarkStart w:id="359" w:name="raporlama-süreci"/>
+      <w:bookmarkStart w:id="363" w:name="raporlama-süreci"/>
       <w:bookmarkEnd w:id="221"/>
       <w:r>
         <w:rPr>
@@ -13699,9 +13705,9 @@
       <w:pPr>
         <w:pStyle w:val="Balk2"/>
       </w:pPr>
-      <w:bookmarkStart w:id="360" w:name="admin-yapılandırma-settings-ekranı"/>
+      <w:bookmarkStart w:id="364" w:name="admin-yapılandırma-settings-ekranı"/>
       <w:bookmarkEnd w:id="216"/>
-      <w:bookmarkEnd w:id="359"/>
+      <w:bookmarkEnd w:id="363"/>
       <w:r>
         <w:t>Admin / Yapılandırma (Settings) Ekranı</w:t>
       </w:r>
@@ -13727,7 +13733,7 @@
           <w:lang w:val="tr-TR"/>
         </w:rPr>
       </w:pPr>
-      <w:bookmarkStart w:id="361" w:name="sistem-ayarları-alan-listesi"/>
+      <w:bookmarkStart w:id="365" w:name="sistem-ayarları-alan-listesi"/>
       <w:r>
         <w:rPr>
           <w:lang w:val="tr-TR"/>
@@ -13926,7 +13932,7 @@
       </w:tr>
       <w:tr>
         <w:trPr>
-          <w:del w:id="362" w:author="Toygun Baysal" w:date="2026-03-12T16:09:00Z" w16du:dateUtc="2026-03-12T13:09:00Z"/>
+          <w:del w:id="366" w:author="Toygun Baysal" w:date="2026-03-12T16:09:00Z"/>
         </w:trPr>
         <w:tc>
           <w:tcPr>
@@ -13936,49 +13942,49 @@
             <w:pPr>
               <w:pStyle w:val="Compact"/>
               <w:rPr>
-                <w:del w:id="363" w:author="Toygun Baysal" w:date="2026-03-12T16:09:00Z" w16du:dateUtc="2026-03-12T13:09:00Z"/>
-                <w:lang w:val="tr-TR"/>
-              </w:rPr>
-            </w:pPr>
-          </w:p>
-        </w:tc>
-        <w:tc>
-          <w:tcPr>
-            <w:tcW w:w="0" w:type="auto"/>
-          </w:tcPr>
-          <w:p>
-            <w:pPr>
-              <w:pStyle w:val="Compact"/>
-              <w:rPr>
-                <w:del w:id="364" w:author="Toygun Baysal" w:date="2026-03-12T16:09:00Z" w16du:dateUtc="2026-03-12T13:09:00Z"/>
-                <w:lang w:val="tr-TR"/>
-              </w:rPr>
-            </w:pPr>
-          </w:p>
-        </w:tc>
-        <w:tc>
-          <w:tcPr>
-            <w:tcW w:w="0" w:type="auto"/>
-          </w:tcPr>
-          <w:p>
-            <w:pPr>
-              <w:pStyle w:val="Compact"/>
-              <w:rPr>
-                <w:del w:id="365" w:author="Toygun Baysal" w:date="2026-03-12T16:09:00Z" w16du:dateUtc="2026-03-12T13:09:00Z"/>
-                <w:lang w:val="tr-TR"/>
-              </w:rPr>
-            </w:pPr>
-          </w:p>
-        </w:tc>
-        <w:tc>
-          <w:tcPr>
-            <w:tcW w:w="0" w:type="auto"/>
-          </w:tcPr>
-          <w:p>
-            <w:pPr>
-              <w:pStyle w:val="Compact"/>
-              <w:rPr>
-                <w:del w:id="366" w:author="Toygun Baysal" w:date="2026-03-12T16:09:00Z" w16du:dateUtc="2026-03-12T13:09:00Z"/>
+                <w:del w:id="367" w:author="Toygun Baysal" w:date="2026-03-12T16:09:00Z" w16du:dateUtc="2026-03-12T13:09:00Z"/>
+                <w:lang w:val="tr-TR"/>
+              </w:rPr>
+            </w:pPr>
+          </w:p>
+        </w:tc>
+        <w:tc>
+          <w:tcPr>
+            <w:tcW w:w="0" w:type="auto"/>
+          </w:tcPr>
+          <w:p>
+            <w:pPr>
+              <w:pStyle w:val="Compact"/>
+              <w:rPr>
+                <w:del w:id="368" w:author="Toygun Baysal" w:date="2026-03-12T16:09:00Z" w16du:dateUtc="2026-03-12T13:09:00Z"/>
+                <w:lang w:val="tr-TR"/>
+              </w:rPr>
+            </w:pPr>
+          </w:p>
+        </w:tc>
+        <w:tc>
+          <w:tcPr>
+            <w:tcW w:w="0" w:type="auto"/>
+          </w:tcPr>
+          <w:p>
+            <w:pPr>
+              <w:pStyle w:val="Compact"/>
+              <w:rPr>
+                <w:del w:id="369" w:author="Toygun Baysal" w:date="2026-03-12T16:09:00Z" w16du:dateUtc="2026-03-12T13:09:00Z"/>
+                <w:lang w:val="tr-TR"/>
+              </w:rPr>
+            </w:pPr>
+          </w:p>
+        </w:tc>
+        <w:tc>
+          <w:tcPr>
+            <w:tcW w:w="0" w:type="auto"/>
+          </w:tcPr>
+          <w:p>
+            <w:pPr>
+              <w:pStyle w:val="Compact"/>
+              <w:rPr>
+                <w:del w:id="370" w:author="Toygun Baysal" w:date="2026-03-12T16:09:00Z" w16du:dateUtc="2026-03-12T13:09:00Z"/>
                 <w:lang w:val="tr-TR"/>
               </w:rPr>
             </w:pPr>
@@ -13987,7 +13993,7 @@
       </w:tr>
       <w:tr>
         <w:trPr>
-          <w:del w:id="367" w:author="Toygun Baysal" w:date="2026-03-12T16:09:00Z" w16du:dateUtc="2026-03-12T13:09:00Z"/>
+          <w:del w:id="371" w:author="Toygun Baysal" w:date="2026-03-12T16:09:00Z"/>
         </w:trPr>
         <w:tc>
           <w:tcPr>
@@ -13997,49 +14003,49 @@
             <w:pPr>
               <w:pStyle w:val="Compact"/>
               <w:rPr>
-                <w:del w:id="368" w:author="Toygun Baysal" w:date="2026-03-12T16:09:00Z" w16du:dateUtc="2026-03-12T13:09:00Z"/>
-                <w:lang w:val="tr-TR"/>
-              </w:rPr>
-            </w:pPr>
-          </w:p>
-        </w:tc>
-        <w:tc>
-          <w:tcPr>
-            <w:tcW w:w="0" w:type="auto"/>
-          </w:tcPr>
-          <w:p>
-            <w:pPr>
-              <w:pStyle w:val="Compact"/>
-              <w:rPr>
-                <w:del w:id="369" w:author="Toygun Baysal" w:date="2026-03-12T16:09:00Z" w16du:dateUtc="2026-03-12T13:09:00Z"/>
-                <w:lang w:val="tr-TR"/>
-              </w:rPr>
-            </w:pPr>
-          </w:p>
-        </w:tc>
-        <w:tc>
-          <w:tcPr>
-            <w:tcW w:w="0" w:type="auto"/>
-          </w:tcPr>
-          <w:p>
-            <w:pPr>
-              <w:pStyle w:val="Compact"/>
-              <w:rPr>
-                <w:del w:id="370" w:author="Toygun Baysal" w:date="2026-03-12T16:09:00Z" w16du:dateUtc="2026-03-12T13:09:00Z"/>
-                <w:lang w:val="tr-TR"/>
-              </w:rPr>
-            </w:pPr>
-          </w:p>
-        </w:tc>
-        <w:tc>
-          <w:tcPr>
-            <w:tcW w:w="0" w:type="auto"/>
-          </w:tcPr>
-          <w:p>
-            <w:pPr>
-              <w:pStyle w:val="Compact"/>
-              <w:rPr>
-                <w:del w:id="371" w:author="Toygun Baysal" w:date="2026-03-12T16:09:00Z" w16du:dateUtc="2026-03-12T13:09:00Z"/>
+                <w:del w:id="372" w:author="Toygun Baysal" w:date="2026-03-12T16:09:00Z" w16du:dateUtc="2026-03-12T13:09:00Z"/>
+                <w:lang w:val="tr-TR"/>
+              </w:rPr>
+            </w:pPr>
+          </w:p>
+        </w:tc>
+        <w:tc>
+          <w:tcPr>
+            <w:tcW w:w="0" w:type="auto"/>
+          </w:tcPr>
+          <w:p>
+            <w:pPr>
+              <w:pStyle w:val="Compact"/>
+              <w:rPr>
+                <w:del w:id="373" w:author="Toygun Baysal" w:date="2026-03-12T16:09:00Z" w16du:dateUtc="2026-03-12T13:09:00Z"/>
+                <w:lang w:val="tr-TR"/>
+              </w:rPr>
+            </w:pPr>
+          </w:p>
+        </w:tc>
+        <w:tc>
+          <w:tcPr>
+            <w:tcW w:w="0" w:type="auto"/>
+          </w:tcPr>
+          <w:p>
+            <w:pPr>
+              <w:pStyle w:val="Compact"/>
+              <w:rPr>
+                <w:del w:id="374" w:author="Toygun Baysal" w:date="2026-03-12T16:09:00Z" w16du:dateUtc="2026-03-12T13:09:00Z"/>
+                <w:lang w:val="tr-TR"/>
+              </w:rPr>
+            </w:pPr>
+          </w:p>
+        </w:tc>
+        <w:tc>
+          <w:tcPr>
+            <w:tcW w:w="0" w:type="auto"/>
+          </w:tcPr>
+          <w:p>
+            <w:pPr>
+              <w:pStyle w:val="Compact"/>
+              <w:rPr>
+                <w:del w:id="375" w:author="Toygun Baysal" w:date="2026-03-12T16:09:00Z" w16du:dateUtc="2026-03-12T13:09:00Z"/>
                 <w:lang w:val="tr-TR"/>
               </w:rPr>
             </w:pPr>
@@ -14048,7 +14054,7 @@
       </w:tr>
       <w:tr>
         <w:trPr>
-          <w:del w:id="372" w:author="Toygun Baysal" w:date="2026-03-12T16:09:00Z" w16du:dateUtc="2026-03-12T13:09:00Z"/>
+          <w:del w:id="376" w:author="Toygun Baysal" w:date="2026-03-12T16:09:00Z"/>
         </w:trPr>
         <w:tc>
           <w:tcPr>
@@ -14058,49 +14064,49 @@
             <w:pPr>
               <w:pStyle w:val="Compact"/>
               <w:rPr>
-                <w:del w:id="373" w:author="Toygun Baysal" w:date="2026-03-12T16:09:00Z" w16du:dateUtc="2026-03-12T13:09:00Z"/>
-                <w:lang w:val="tr-TR"/>
-              </w:rPr>
-            </w:pPr>
-          </w:p>
-        </w:tc>
-        <w:tc>
-          <w:tcPr>
-            <w:tcW w:w="0" w:type="auto"/>
-          </w:tcPr>
-          <w:p>
-            <w:pPr>
-              <w:pStyle w:val="Compact"/>
-              <w:rPr>
-                <w:del w:id="374" w:author="Toygun Baysal" w:date="2026-03-12T16:09:00Z" w16du:dateUtc="2026-03-12T13:09:00Z"/>
-                <w:lang w:val="tr-TR"/>
-              </w:rPr>
-            </w:pPr>
-          </w:p>
-        </w:tc>
-        <w:tc>
-          <w:tcPr>
-            <w:tcW w:w="0" w:type="auto"/>
-          </w:tcPr>
-          <w:p>
-            <w:pPr>
-              <w:pStyle w:val="Compact"/>
-              <w:rPr>
-                <w:del w:id="375" w:author="Toygun Baysal" w:date="2026-03-12T16:09:00Z" w16du:dateUtc="2026-03-12T13:09:00Z"/>
-                <w:lang w:val="tr-TR"/>
-              </w:rPr>
-            </w:pPr>
-          </w:p>
-        </w:tc>
-        <w:tc>
-          <w:tcPr>
-            <w:tcW w:w="0" w:type="auto"/>
-          </w:tcPr>
-          <w:p>
-            <w:pPr>
-              <w:pStyle w:val="Compact"/>
-              <w:rPr>
-                <w:del w:id="376" w:author="Toygun Baysal" w:date="2026-03-12T16:09:00Z" w16du:dateUtc="2026-03-12T13:09:00Z"/>
+                <w:del w:id="377" w:author="Toygun Baysal" w:date="2026-03-12T16:09:00Z" w16du:dateUtc="2026-03-12T13:09:00Z"/>
+                <w:lang w:val="tr-TR"/>
+              </w:rPr>
+            </w:pPr>
+          </w:p>
+        </w:tc>
+        <w:tc>
+          <w:tcPr>
+            <w:tcW w:w="0" w:type="auto"/>
+          </w:tcPr>
+          <w:p>
+            <w:pPr>
+              <w:pStyle w:val="Compact"/>
+              <w:rPr>
+                <w:del w:id="378" w:author="Toygun Baysal" w:date="2026-03-12T16:09:00Z" w16du:dateUtc="2026-03-12T13:09:00Z"/>
+                <w:lang w:val="tr-TR"/>
+              </w:rPr>
+            </w:pPr>
+          </w:p>
+        </w:tc>
+        <w:tc>
+          <w:tcPr>
+            <w:tcW w:w="0" w:type="auto"/>
+          </w:tcPr>
+          <w:p>
+            <w:pPr>
+              <w:pStyle w:val="Compact"/>
+              <w:rPr>
+                <w:del w:id="379" w:author="Toygun Baysal" w:date="2026-03-12T16:09:00Z" w16du:dateUtc="2026-03-12T13:09:00Z"/>
+                <w:lang w:val="tr-TR"/>
+              </w:rPr>
+            </w:pPr>
+          </w:p>
+        </w:tc>
+        <w:tc>
+          <w:tcPr>
+            <w:tcW w:w="0" w:type="auto"/>
+          </w:tcPr>
+          <w:p>
+            <w:pPr>
+              <w:pStyle w:val="Compact"/>
+              <w:rPr>
+                <w:del w:id="380" w:author="Toygun Baysal" w:date="2026-03-12T16:09:00Z" w16du:dateUtc="2026-03-12T13:09:00Z"/>
                 <w:lang w:val="tr-TR"/>
               </w:rPr>
             </w:pPr>
@@ -14109,7 +14115,7 @@
       </w:tr>
       <w:tr>
         <w:trPr>
-          <w:del w:id="377" w:author="Toygun Baysal" w:date="2026-03-12T16:09:00Z" w16du:dateUtc="2026-03-12T13:09:00Z"/>
+          <w:del w:id="381" w:author="Toygun Baysal" w:date="2026-03-12T16:09:00Z"/>
         </w:trPr>
         <w:tc>
           <w:tcPr>
@@ -14119,49 +14125,49 @@
             <w:pPr>
               <w:pStyle w:val="Compact"/>
               <w:rPr>
-                <w:del w:id="378" w:author="Toygun Baysal" w:date="2026-03-12T16:09:00Z" w16du:dateUtc="2026-03-12T13:09:00Z"/>
-                <w:lang w:val="tr-TR"/>
-              </w:rPr>
-            </w:pPr>
-          </w:p>
-        </w:tc>
-        <w:tc>
-          <w:tcPr>
-            <w:tcW w:w="0" w:type="auto"/>
-          </w:tcPr>
-          <w:p>
-            <w:pPr>
-              <w:pStyle w:val="Compact"/>
-              <w:rPr>
-                <w:del w:id="379" w:author="Toygun Baysal" w:date="2026-03-12T16:09:00Z" w16du:dateUtc="2026-03-12T13:09:00Z"/>
-                <w:lang w:val="tr-TR"/>
-              </w:rPr>
-            </w:pPr>
-          </w:p>
-        </w:tc>
-        <w:tc>
-          <w:tcPr>
-            <w:tcW w:w="0" w:type="auto"/>
-          </w:tcPr>
-          <w:p>
-            <w:pPr>
-              <w:pStyle w:val="Compact"/>
-              <w:rPr>
-                <w:del w:id="380" w:author="Toygun Baysal" w:date="2026-03-12T16:09:00Z" w16du:dateUtc="2026-03-12T13:09:00Z"/>
-                <w:lang w:val="tr-TR"/>
-              </w:rPr>
-            </w:pPr>
-          </w:p>
-        </w:tc>
-        <w:tc>
-          <w:tcPr>
-            <w:tcW w:w="0" w:type="auto"/>
-          </w:tcPr>
-          <w:p>
-            <w:pPr>
-              <w:pStyle w:val="Compact"/>
-              <w:rPr>
-                <w:del w:id="381" w:author="Toygun Baysal" w:date="2026-03-12T16:09:00Z" w16du:dateUtc="2026-03-12T13:09:00Z"/>
+                <w:del w:id="382" w:author="Toygun Baysal" w:date="2026-03-12T16:09:00Z" w16du:dateUtc="2026-03-12T13:09:00Z"/>
+                <w:lang w:val="tr-TR"/>
+              </w:rPr>
+            </w:pPr>
+          </w:p>
+        </w:tc>
+        <w:tc>
+          <w:tcPr>
+            <w:tcW w:w="0" w:type="auto"/>
+          </w:tcPr>
+          <w:p>
+            <w:pPr>
+              <w:pStyle w:val="Compact"/>
+              <w:rPr>
+                <w:del w:id="383" w:author="Toygun Baysal" w:date="2026-03-12T16:09:00Z" w16du:dateUtc="2026-03-12T13:09:00Z"/>
+                <w:lang w:val="tr-TR"/>
+              </w:rPr>
+            </w:pPr>
+          </w:p>
+        </w:tc>
+        <w:tc>
+          <w:tcPr>
+            <w:tcW w:w="0" w:type="auto"/>
+          </w:tcPr>
+          <w:p>
+            <w:pPr>
+              <w:pStyle w:val="Compact"/>
+              <w:rPr>
+                <w:del w:id="384" w:author="Toygun Baysal" w:date="2026-03-12T16:09:00Z" w16du:dateUtc="2026-03-12T13:09:00Z"/>
+                <w:lang w:val="tr-TR"/>
+              </w:rPr>
+            </w:pPr>
+          </w:p>
+        </w:tc>
+        <w:tc>
+          <w:tcPr>
+            <w:tcW w:w="0" w:type="auto"/>
+          </w:tcPr>
+          <w:p>
+            <w:pPr>
+              <w:pStyle w:val="Compact"/>
+              <w:rPr>
+                <w:del w:id="385" w:author="Toygun Baysal" w:date="2026-03-12T16:09:00Z" w16du:dateUtc="2026-03-12T13:09:00Z"/>
                 <w:lang w:val="tr-TR"/>
               </w:rPr>
             </w:pPr>
@@ -14170,7 +14176,7 @@
       </w:tr>
       <w:tr>
         <w:trPr>
-          <w:del w:id="382" w:author="Toygun Baysal" w:date="2026-03-12T16:09:00Z" w16du:dateUtc="2026-03-12T13:09:00Z"/>
+          <w:del w:id="386" w:author="Toygun Baysal" w:date="2026-03-12T16:09:00Z"/>
         </w:trPr>
         <w:tc>
           <w:tcPr>
@@ -14180,49 +14186,49 @@
             <w:pPr>
               <w:pStyle w:val="Compact"/>
               <w:rPr>
-                <w:del w:id="383" w:author="Toygun Baysal" w:date="2026-03-12T16:09:00Z" w16du:dateUtc="2026-03-12T13:09:00Z"/>
-                <w:lang w:val="tr-TR"/>
-              </w:rPr>
-            </w:pPr>
-          </w:p>
-        </w:tc>
-        <w:tc>
-          <w:tcPr>
-            <w:tcW w:w="0" w:type="auto"/>
-          </w:tcPr>
-          <w:p>
-            <w:pPr>
-              <w:pStyle w:val="Compact"/>
-              <w:rPr>
-                <w:del w:id="384" w:author="Toygun Baysal" w:date="2026-03-12T16:09:00Z" w16du:dateUtc="2026-03-12T13:09:00Z"/>
-                <w:lang w:val="tr-TR"/>
-              </w:rPr>
-            </w:pPr>
-          </w:p>
-        </w:tc>
-        <w:tc>
-          <w:tcPr>
-            <w:tcW w:w="0" w:type="auto"/>
-          </w:tcPr>
-          <w:p>
-            <w:pPr>
-              <w:pStyle w:val="Compact"/>
-              <w:rPr>
-                <w:del w:id="385" w:author="Toygun Baysal" w:date="2026-03-12T16:09:00Z" w16du:dateUtc="2026-03-12T13:09:00Z"/>
-                <w:lang w:val="tr-TR"/>
-              </w:rPr>
-            </w:pPr>
-          </w:p>
-        </w:tc>
-        <w:tc>
-          <w:tcPr>
-            <w:tcW w:w="0" w:type="auto"/>
-          </w:tcPr>
-          <w:p>
-            <w:pPr>
-              <w:pStyle w:val="Compact"/>
-              <w:rPr>
-                <w:del w:id="386" w:author="Toygun Baysal" w:date="2026-03-12T16:09:00Z" w16du:dateUtc="2026-03-12T13:09:00Z"/>
+                <w:del w:id="387" w:author="Toygun Baysal" w:date="2026-03-12T16:09:00Z" w16du:dateUtc="2026-03-12T13:09:00Z"/>
+                <w:lang w:val="tr-TR"/>
+              </w:rPr>
+            </w:pPr>
+          </w:p>
+        </w:tc>
+        <w:tc>
+          <w:tcPr>
+            <w:tcW w:w="0" w:type="auto"/>
+          </w:tcPr>
+          <w:p>
+            <w:pPr>
+              <w:pStyle w:val="Compact"/>
+              <w:rPr>
+                <w:del w:id="388" w:author="Toygun Baysal" w:date="2026-03-12T16:09:00Z" w16du:dateUtc="2026-03-12T13:09:00Z"/>
+                <w:lang w:val="tr-TR"/>
+              </w:rPr>
+            </w:pPr>
+          </w:p>
+        </w:tc>
+        <w:tc>
+          <w:tcPr>
+            <w:tcW w:w="0" w:type="auto"/>
+          </w:tcPr>
+          <w:p>
+            <w:pPr>
+              <w:pStyle w:val="Compact"/>
+              <w:rPr>
+                <w:del w:id="389" w:author="Toygun Baysal" w:date="2026-03-12T16:09:00Z" w16du:dateUtc="2026-03-12T13:09:00Z"/>
+                <w:lang w:val="tr-TR"/>
+              </w:rPr>
+            </w:pPr>
+          </w:p>
+        </w:tc>
+        <w:tc>
+          <w:tcPr>
+            <w:tcW w:w="0" w:type="auto"/>
+          </w:tcPr>
+          <w:p>
+            <w:pPr>
+              <w:pStyle w:val="Compact"/>
+              <w:rPr>
+                <w:del w:id="390" w:author="Toygun Baysal" w:date="2026-03-12T16:09:00Z" w16du:dateUtc="2026-03-12T13:09:00Z"/>
                 <w:lang w:val="tr-TR"/>
               </w:rPr>
             </w:pPr>
@@ -14231,7 +14237,7 @@
       </w:tr>
       <w:tr>
         <w:trPr>
-          <w:del w:id="387" w:author="Toygun Baysal" w:date="2026-03-12T16:09:00Z" w16du:dateUtc="2026-03-12T13:09:00Z"/>
+          <w:del w:id="391" w:author="Toygun Baysal" w:date="2026-03-12T16:09:00Z"/>
         </w:trPr>
         <w:tc>
           <w:tcPr>
@@ -14241,49 +14247,49 @@
             <w:pPr>
               <w:pStyle w:val="Compact"/>
               <w:rPr>
-                <w:del w:id="388" w:author="Toygun Baysal" w:date="2026-03-12T16:09:00Z" w16du:dateUtc="2026-03-12T13:09:00Z"/>
-                <w:lang w:val="tr-TR"/>
-              </w:rPr>
-            </w:pPr>
-          </w:p>
-        </w:tc>
-        <w:tc>
-          <w:tcPr>
-            <w:tcW w:w="0" w:type="auto"/>
-          </w:tcPr>
-          <w:p>
-            <w:pPr>
-              <w:pStyle w:val="Compact"/>
-              <w:rPr>
-                <w:del w:id="389" w:author="Toygun Baysal" w:date="2026-03-12T16:09:00Z" w16du:dateUtc="2026-03-12T13:09:00Z"/>
-                <w:lang w:val="tr-TR"/>
-              </w:rPr>
-            </w:pPr>
-          </w:p>
-        </w:tc>
-        <w:tc>
-          <w:tcPr>
-            <w:tcW w:w="0" w:type="auto"/>
-          </w:tcPr>
-          <w:p>
-            <w:pPr>
-              <w:pStyle w:val="Compact"/>
-              <w:rPr>
-                <w:del w:id="390" w:author="Toygun Baysal" w:date="2026-03-12T16:09:00Z" w16du:dateUtc="2026-03-12T13:09:00Z"/>
-                <w:lang w:val="tr-TR"/>
-              </w:rPr>
-            </w:pPr>
-          </w:p>
-        </w:tc>
-        <w:tc>
-          <w:tcPr>
-            <w:tcW w:w="0" w:type="auto"/>
-          </w:tcPr>
-          <w:p>
-            <w:pPr>
-              <w:pStyle w:val="Compact"/>
-              <w:rPr>
-                <w:del w:id="391" w:author="Toygun Baysal" w:date="2026-03-12T16:09:00Z" w16du:dateUtc="2026-03-12T13:09:00Z"/>
+                <w:del w:id="392" w:author="Toygun Baysal" w:date="2026-03-12T16:09:00Z" w16du:dateUtc="2026-03-12T13:09:00Z"/>
+                <w:lang w:val="tr-TR"/>
+              </w:rPr>
+            </w:pPr>
+          </w:p>
+        </w:tc>
+        <w:tc>
+          <w:tcPr>
+            <w:tcW w:w="0" w:type="auto"/>
+          </w:tcPr>
+          <w:p>
+            <w:pPr>
+              <w:pStyle w:val="Compact"/>
+              <w:rPr>
+                <w:del w:id="393" w:author="Toygun Baysal" w:date="2026-03-12T16:09:00Z" w16du:dateUtc="2026-03-12T13:09:00Z"/>
+                <w:lang w:val="tr-TR"/>
+              </w:rPr>
+            </w:pPr>
+          </w:p>
+        </w:tc>
+        <w:tc>
+          <w:tcPr>
+            <w:tcW w:w="0" w:type="auto"/>
+          </w:tcPr>
+          <w:p>
+            <w:pPr>
+              <w:pStyle w:val="Compact"/>
+              <w:rPr>
+                <w:del w:id="394" w:author="Toygun Baysal" w:date="2026-03-12T16:09:00Z" w16du:dateUtc="2026-03-12T13:09:00Z"/>
+                <w:lang w:val="tr-TR"/>
+              </w:rPr>
+            </w:pPr>
+          </w:p>
+        </w:tc>
+        <w:tc>
+          <w:tcPr>
+            <w:tcW w:w="0" w:type="auto"/>
+          </w:tcPr>
+          <w:p>
+            <w:pPr>
+              <w:pStyle w:val="Compact"/>
+              <w:rPr>
+                <w:del w:id="395" w:author="Toygun Baysal" w:date="2026-03-12T16:09:00Z" w16du:dateUtc="2026-03-12T13:09:00Z"/>
                 <w:lang w:val="tr-TR"/>
               </w:rPr>
             </w:pPr>
@@ -14373,10 +14379,10 @@
       <w:pPr>
         <w:pStyle w:val="Balk1"/>
       </w:pPr>
-      <w:bookmarkStart w:id="392" w:name="bildirim-sistemi-notifications"/>
+      <w:bookmarkStart w:id="396" w:name="bildirim-sistemi-notifications"/>
       <w:bookmarkEnd w:id="76"/>
-      <w:bookmarkEnd w:id="360"/>
-      <w:bookmarkEnd w:id="361"/>
+      <w:bookmarkEnd w:id="364"/>
+      <w:bookmarkEnd w:id="365"/>
       <w:r>
         <w:t>İnceleme</w:t>
       </w:r>
@@ -14401,8 +14407,8 @@
         </w:rPr>
         <w:t xml:space="preserve">Bu bölüm, SCM sistemindeki İnceleme (Review) sürecinin tüm detaylarını kapsar. </w:t>
       </w:r>
-      <w:commentRangeStart w:id="393"/>
-      <w:commentRangeStart w:id="394"/>
+      <w:commentRangeStart w:id="397"/>
+      <w:commentRangeStart w:id="398"/>
       <w:r>
         <w:rPr>
           <w:rFonts w:ascii="Arial" w:eastAsia="Arial" w:hAnsi="Arial" w:cs="Arial"/>
@@ -14411,7 +14417,7 @@
         </w:rPr>
         <w:t>Review, vaka sistemi içindeki informal bir eş değerlendirme (peer review/feedback) mekanizmasıdır.</w:t>
       </w:r>
-      <w:commentRangeEnd w:id="393"/>
+      <w:commentRangeEnd w:id="397"/>
       <w:r>
         <w:rPr>
           <w:rStyle w:val="AklamaBavurusu"/>
@@ -14419,9 +14425,9 @@
           <w:sz w:val="21"/>
           <w:szCs w:val="21"/>
         </w:rPr>
-        <w:commentReference w:id="393"/>
-      </w:r>
-      <w:commentRangeEnd w:id="394"/>
+        <w:commentReference w:id="397"/>
+      </w:r>
+      <w:commentRangeEnd w:id="398"/>
       <w:r>
         <w:rPr>
           <w:rStyle w:val="AklamaBavurusu"/>
@@ -14429,7 +14435,7 @@
           <w:sz w:val="21"/>
           <w:szCs w:val="21"/>
         </w:rPr>
-        <w:commentReference w:id="394"/>
+        <w:commentReference w:id="398"/>
       </w:r>
       <w:r>
         <w:rPr>
@@ -14612,7 +14618,7 @@
         </w:rPr>
         <w:t xml:space="preserve">Sistem içi (SCM kullanıcılarına) ve </w:t>
       </w:r>
-      <w:commentRangeStart w:id="395"/>
+      <w:commentRangeStart w:id="399"/>
       <w:r>
         <w:rPr>
           <w:sz w:val="21"/>
@@ -14620,14 +14626,14 @@
         </w:rPr>
         <w:t>sistem dışı (e-posta davetli harici kişilere) review gönderilebilir.</w:t>
       </w:r>
-      <w:commentRangeEnd w:id="395"/>
+      <w:commentRangeEnd w:id="399"/>
       <w:r>
         <w:rPr>
           <w:rStyle w:val="AklamaBavurusu"/>
           <w:sz w:val="21"/>
           <w:szCs w:val="21"/>
         </w:rPr>
-        <w:commentReference w:id="395"/>
+        <w:commentReference w:id="399"/>
       </w:r>
     </w:p>
     <w:p>
@@ -15602,7 +15608,7 @@
               </w:rPr>
               <w:t xml:space="preserve">Case ID, Ad, </w:t>
             </w:r>
-            <w:del w:id="396" w:author="Toygun Baysal" w:date="2026-03-10T15:54:00Z" w16du:dateUtc="2026-03-10T12:54:00Z">
+            <w:del w:id="400" w:author="Toygun Baysal" w:date="2026-03-10T15:54:00Z" w16du:dateUtc="2026-03-10T12:54:00Z">
               <w:r>
                 <w:rPr>
                   <w:rFonts w:ascii="Arial" w:eastAsia="Arial" w:hAnsi="Arial" w:cs="Arial"/>
@@ -16418,8 +16424,8 @@
           <w:szCs w:val="21"/>
         </w:rPr>
       </w:pPr>
-      <w:commentRangeStart w:id="397"/>
-      <w:commentRangeStart w:id="398"/>
+      <w:commentRangeStart w:id="401"/>
+      <w:commentRangeStart w:id="402"/>
       <w:r>
         <w:rPr>
           <w:rFonts w:ascii="Arial" w:eastAsia="Arial" w:hAnsi="Arial" w:cs="Arial"/>
@@ -16428,7 +16434,7 @@
         </w:rPr>
         <w:t>Reviewer, inceleme sürecinde bir veya birden fazla yorum yazabilir</w:t>
       </w:r>
-      <w:commentRangeEnd w:id="397"/>
+      <w:commentRangeEnd w:id="401"/>
       <w:r>
         <w:rPr>
           <w:rStyle w:val="AklamaBavurusu"/>
@@ -16436,9 +16442,9 @@
           <w:sz w:val="21"/>
           <w:szCs w:val="21"/>
         </w:rPr>
-        <w:commentReference w:id="397"/>
-      </w:r>
-      <w:commentRangeEnd w:id="398"/>
+        <w:commentReference w:id="401"/>
+      </w:r>
+      <w:commentRangeEnd w:id="402"/>
       <w:r>
         <w:rPr>
           <w:rStyle w:val="AklamaBavurusu"/>
@@ -16446,7 +16452,7 @@
           <w:sz w:val="21"/>
           <w:szCs w:val="21"/>
         </w:rPr>
-        <w:commentReference w:id="398"/>
+        <w:commentReference w:id="402"/>
       </w:r>
       <w:r>
         <w:rPr>
@@ -16891,7 +16897,7 @@
       <w:pPr>
         <w:spacing w:after="120" w:line="276" w:lineRule="auto"/>
       </w:pPr>
-      <w:del w:id="399" w:author="Toygun Baysal" w:date="2026-03-10T16:24:00Z" w16du:dateUtc="2026-03-10T13:24:00Z">
+      <w:del w:id="403" w:author="Toygun Baysal" w:date="2026-03-10T16:24:00Z" w16du:dateUtc="2026-03-10T13:24:00Z">
         <w:r>
           <w:rPr>
             <w:rFonts w:ascii="Arial" w:eastAsia="Arial" w:hAnsi="Arial" w:cs="Arial"/>
@@ -16901,7 +16907,7 @@
           <w:delText>Başarılı doğrulama sonrası dış reviewer’a özel bir ara yüz açılır. Bu ara yüz SCM ana arayüzünden farklıdır — sol menü, üst başlık ve navigasyon yoktur. Yalnızca davet edildiği vakayı görüntüler</w:delText>
         </w:r>
       </w:del>
-      <w:ins w:id="400" w:author="Toygun Baysal" w:date="2026-03-10T16:24:00Z" w16du:dateUtc="2026-03-10T13:24:00Z">
+      <w:ins w:id="404" w:author="Toygun Baysal" w:date="2026-03-10T16:24:00Z" w16du:dateUtc="2026-03-10T13:24:00Z">
         <w:r>
           <w:rPr>
             <w:rFonts w:ascii="Arial" w:eastAsia="Arial" w:hAnsi="Arial" w:cs="Arial"/>
@@ -16918,7 +16924,7 @@
           </w:rPr>
           <w:t xml:space="preserve">Dış incelemeciye e-posta ile gönderilen magic link tek kullanımlıktır (single-use) ve </w:t>
         </w:r>
-        <w:commentRangeStart w:id="401"/>
+        <w:commentRangeStart w:id="405"/>
         <w:r>
           <w:rPr>
             <w:rFonts w:ascii="Arial" w:eastAsia="Arial" w:hAnsi="Arial" w:cs="Arial"/>
@@ -16928,7 +16934,7 @@
           <w:t xml:space="preserve">24 </w:t>
         </w:r>
       </w:ins>
-      <w:commentRangeEnd w:id="401"/>
+      <w:commentRangeEnd w:id="405"/>
       <w:r>
         <w:rPr>
           <w:rStyle w:val="AklamaBavurusu"/>
@@ -16936,9 +16942,9 @@
           <w:sz w:val="21"/>
           <w:szCs w:val="21"/>
         </w:rPr>
-        <w:commentReference w:id="401"/>
-      </w:r>
-      <w:ins w:id="402" w:author="Toygun Baysal" w:date="2026-03-10T16:24:00Z" w16du:dateUtc="2026-03-10T13:24:00Z">
+        <w:commentReference w:id="405"/>
+      </w:r>
+      <w:ins w:id="406" w:author="Toygun Baysal" w:date="2026-03-10T16:24:00Z" w16du:dateUtc="2026-03-10T13:24:00Z">
         <w:r>
           <w:rPr>
             <w:rFonts w:ascii="Arial" w:eastAsia="Arial" w:hAnsi="Arial" w:cs="Arial"/>
@@ -16947,7 +16953,7 @@
           </w:rPr>
           <w:t xml:space="preserve">saat geçerlilik süresine sahiptir. Link’e ilk tıklandığında </w:t>
         </w:r>
-        <w:commentRangeStart w:id="403"/>
+        <w:commentRangeStart w:id="407"/>
         <w:r>
           <w:rPr>
             <w:rFonts w:ascii="Arial" w:eastAsia="Arial" w:hAnsi="Arial" w:cs="Arial"/>
@@ -16956,7 +16962,7 @@
           </w:rPr>
           <w:t>basit bir kimlik doğrulama adımı (Ad Soyad eşleştirmesi)</w:t>
         </w:r>
-        <w:commentRangeEnd w:id="403"/>
+        <w:commentRangeEnd w:id="407"/>
         <w:r>
           <w:rPr>
             <w:rStyle w:val="AklamaBavurusu"/>
@@ -16964,7 +16970,7 @@
             <w:sz w:val="21"/>
             <w:szCs w:val="21"/>
           </w:rPr>
-          <w:commentReference w:id="403"/>
+          <w:commentReference w:id="407"/>
         </w:r>
         <w:r>
           <w:rPr>
@@ -16974,7 +16980,7 @@
           </w:rPr>
           <w:t xml:space="preserve"> sonrasında oturum başlatılır ve token kullanılmış olarak işaretlenir. Başarılı doğrulama sonrası </w:t>
         </w:r>
-        <w:commentRangeStart w:id="404"/>
+        <w:commentRangeStart w:id="408"/>
         <w:r>
           <w:rPr>
             <w:rFonts w:ascii="Arial" w:eastAsia="Arial" w:hAnsi="Arial" w:cs="Arial"/>
@@ -16983,7 +16989,7 @@
           </w:rPr>
           <w:t>dış reviewer’a özel bir ara yüz açılır</w:t>
         </w:r>
-        <w:commentRangeEnd w:id="404"/>
+        <w:commentRangeEnd w:id="408"/>
         <w:r>
           <w:rPr>
             <w:rStyle w:val="AklamaBavurusu"/>
@@ -16991,7 +16997,7 @@
             <w:sz w:val="21"/>
             <w:szCs w:val="21"/>
           </w:rPr>
-          <w:commentReference w:id="404"/>
+          <w:commentReference w:id="408"/>
         </w:r>
         <w:r>
           <w:rPr>
@@ -17121,7 +17127,7 @@
         </w:rPr>
         <w:t xml:space="preserve">Session timeout: </w:t>
       </w:r>
-      <w:ins w:id="405" w:author="Toygun Baysal" w:date="2026-03-10T16:25:00Z" w16du:dateUtc="2026-03-10T13:25:00Z">
+      <w:ins w:id="409" w:author="Toygun Baysal" w:date="2026-03-10T16:25:00Z" w16du:dateUtc="2026-03-10T13:25:00Z">
         <w:r>
           <w:rPr>
             <w:sz w:val="21"/>
@@ -17130,7 +17136,7 @@
           <w:t>Magic link tek kullanımlıktır (single-use): Link ilk kez tıklanıp oturum başlatıldığında token kullanılmış olarak işaretlenir ve aynı link ile ikinci bir erişim engellenir. Link’in geçerlilik süresi (expiry): Davet gönderiminden itibaren 24 saat içinde kullanılmazsa token otomatik olarak expire olur. Expire olan davet için case owner yeni davet göndermelidir.</w:t>
         </w:r>
       </w:ins>
-      <w:del w:id="406" w:author="Toygun Baysal" w:date="2026-03-10T16:25:00Z" w16du:dateUtc="2026-03-10T13:25:00Z">
+      <w:del w:id="410" w:author="Toygun Baysal" w:date="2026-03-10T16:25:00Z" w16du:dateUtc="2026-03-10T13:25:00Z">
         <w:r>
           <w:rPr>
             <w:sz w:val="21"/>
@@ -17149,7 +17155,7 @@
         </w:numPr>
         <w:spacing w:after="120"/>
       </w:pPr>
-      <w:ins w:id="407" w:author="Toygun Baysal" w:date="2026-03-10T16:26:00Z" w16du:dateUtc="2026-03-10T13:26:00Z">
+      <w:ins w:id="411" w:author="Toygun Baysal" w:date="2026-03-10T16:26:00Z" w16du:dateUtc="2026-03-10T13:26:00Z">
         <w:r>
           <w:rPr>
             <w:sz w:val="21"/>
@@ -17158,7 +17164,7 @@
           <w:t>Review tamamlandıktan sonra “Teşekkürler” sayfasına yönlendirilir ve token kalıcı olarak geçersiz hale gelir. Link zaten tek kullanımlık olduğundan, tamamlama sonrası aynı link ile tekrar erişim mümkün değildir.</w:t>
         </w:r>
       </w:ins>
-      <w:del w:id="408" w:author="Toygun Baysal" w:date="2026-03-10T16:26:00Z" w16du:dateUtc="2026-03-10T13:26:00Z">
+      <w:del w:id="412" w:author="Toygun Baysal" w:date="2026-03-10T16:26:00Z" w16du:dateUtc="2026-03-10T13:26:00Z">
         <w:r>
           <w:rPr>
             <w:sz w:val="21"/>
@@ -17957,7 +17963,7 @@
               </w:rPr>
               <w:t>Fraud inceleme daveti + magic link</w:t>
             </w:r>
-            <w:ins w:id="409" w:author="Toygun Baysal" w:date="2026-03-10T16:26:00Z" w16du:dateUtc="2026-03-10T13:26:00Z">
+            <w:ins w:id="413" w:author="Toygun Baysal" w:date="2026-03-10T16:26:00Z" w16du:dateUtc="2026-03-10T13:26:00Z">
               <w:r>
                 <w:rPr>
                   <w:rFonts w:ascii="Arial" w:eastAsia="Arial" w:hAnsi="Arial" w:cs="Arial"/>
@@ -19409,7 +19415,7 @@
       <w:pPr>
         <w:pStyle w:val="Balk2"/>
       </w:pPr>
-      <w:bookmarkStart w:id="410" w:name="uygulama-içi-bildirimler"/>
+      <w:bookmarkStart w:id="414" w:name="uygulama-içi-bildirimler"/>
       <w:r>
         <w:t>Uygulama İçi Bildirimler</w:t>
       </w:r>
@@ -19435,7 +19441,7 @@
           <w:lang w:val="tr-TR"/>
         </w:rPr>
       </w:pPr>
-      <w:bookmarkStart w:id="411" w:name="bildirim-tetikleyicileri"/>
+      <w:bookmarkStart w:id="415" w:name="bildirim-tetikleyicileri"/>
       <w:r>
         <w:rPr>
           <w:lang w:val="tr-TR"/>
@@ -19824,9 +19830,9 @@
       <w:pPr>
         <w:pStyle w:val="Balk2"/>
       </w:pPr>
-      <w:bookmarkStart w:id="412" w:name="e-posta-bildirimleri"/>
-      <w:bookmarkEnd w:id="410"/>
-      <w:bookmarkEnd w:id="411"/>
+      <w:bookmarkStart w:id="416" w:name="e-posta-bildirimleri"/>
+      <w:bookmarkEnd w:id="414"/>
+      <w:bookmarkEnd w:id="415"/>
       <w:r>
         <w:t>E-posta Bildirimleri</w:t>
       </w:r>
@@ -19852,7 +19858,7 @@
           <w:lang w:val="tr-TR"/>
         </w:rPr>
       </w:pPr>
-      <w:bookmarkStart w:id="413" w:name="e-posta-bildirim-kapsamı"/>
+      <w:bookmarkStart w:id="417" w:name="e-posta-bildirim-kapsamı"/>
       <w:r>
         <w:rPr>
           <w:lang w:val="tr-TR"/>
@@ -19924,10 +19930,10 @@
       <w:pPr>
         <w:pStyle w:val="Balk1"/>
       </w:pPr>
-      <w:bookmarkStart w:id="414" w:name="uçtan-uca-soruşturma-iş-akışı"/>
-      <w:bookmarkEnd w:id="392"/>
-      <w:bookmarkEnd w:id="412"/>
-      <w:bookmarkEnd w:id="413"/>
+      <w:bookmarkStart w:id="418" w:name="uçtan-uca-soruşturma-iş-akışı"/>
+      <w:bookmarkEnd w:id="396"/>
+      <w:bookmarkEnd w:id="416"/>
+      <w:bookmarkEnd w:id="417"/>
       <w:r>
         <w:t>Uçtan Uca Akış</w:t>
       </w:r>
@@ -20961,8 +20967,8 @@
       <w:pPr>
         <w:pStyle w:val="Balk1"/>
       </w:pPr>
-      <w:bookmarkStart w:id="415" w:name="rol-bazlı-erişim-matrisi"/>
-      <w:bookmarkEnd w:id="414"/>
+      <w:bookmarkStart w:id="419" w:name="rol-bazlı-erişim-matrisi"/>
+      <w:bookmarkEnd w:id="418"/>
       <w:r>
         <w:t>Yetki ve Rol Modeli</w:t>
       </w:r>
@@ -21012,7 +21018,7 @@
         </w:rPr>
         <w:t xml:space="preserve">Sistem Dışı Reviewer Daveti: Bir analist veya yönetici, SCM hesabı olmayan sistem dışı kişileri (örn. şube operatörü) belirli bir vaka için review yapmaya davet edebilir. </w:t>
       </w:r>
-      <w:ins w:id="416" w:author="Toygun Baysal" w:date="2026-03-10T16:27:00Z" w16du:dateUtc="2026-03-10T13:27:00Z">
+      <w:ins w:id="420" w:author="Toygun Baysal" w:date="2026-03-10T16:27:00Z" w16du:dateUtc="2026-03-10T13:27:00Z">
         <w:r>
           <w:rPr>
             <w:lang w:val="tr-TR"/>
@@ -21020,7 +21026,7 @@
           <w:t>Davet e-posta yoluyla tek kullanımlık (single-use) magic link ile gönderilir. Magic link 72 saat geçerlilik süresine sahiptir; ilk kullanımda token tüketilir ve aynı link ile ikinci erişim engellenir. Davet edilen kişi yalnızca davet edildiği vakayı görüntüleyebilir ve review notu ekleyebilir; başka herhangi bir vakaya ya da sistem özelliğine erişimi yoktur. Reviewer rolü sistemde ayrı bir rol olarak tanımlanır ve içinde review yetkisi (case_review) bulunur. Review yetkisi geleneksel roller (Fraud Analist, Yönetici vb.) altında da atanabilir</w:t>
         </w:r>
       </w:ins>
-      <w:del w:id="417" w:author="Toygun Baysal" w:date="2026-03-10T16:27:00Z" w16du:dateUtc="2026-03-10T13:27:00Z">
+      <w:del w:id="421" w:author="Toygun Baysal" w:date="2026-03-10T16:27:00Z" w16du:dateUtc="2026-03-10T13:27:00Z">
         <w:r>
           <w:rPr>
             <w:lang w:val="tr-TR"/>
@@ -21072,7 +21078,7 @@
                 <w:lang w:val="tr-TR"/>
               </w:rPr>
             </w:pPr>
-            <w:commentRangeStart w:id="418"/>
+            <w:commentRangeStart w:id="422"/>
             <w:r>
               <w:rPr>
                 <w:b/>
@@ -21102,7 +21108,7 @@
               </w:rPr>
               <w:t>Fraud Analist</w:t>
             </w:r>
-            <w:commentRangeEnd w:id="418"/>
+            <w:commentRangeEnd w:id="422"/>
             <w:r>
               <w:rPr>
                 <w:rStyle w:val="AklamaBavurusu"/>
@@ -21110,7 +21116,7 @@
                 <w:szCs w:val="24"/>
                 <w:lang w:val="tr-TR"/>
               </w:rPr>
-              <w:commentReference w:id="418"/>
+              <w:commentReference w:id="422"/>
             </w:r>
           </w:p>
         </w:tc>
@@ -22665,8 +22671,8 @@
       <w:pPr>
         <w:pStyle w:val="Balk1"/>
       </w:pPr>
-      <w:bookmarkStart w:id="419" w:name="güvenlik-denetim-ve-uyumluluk"/>
-      <w:bookmarkEnd w:id="415"/>
+      <w:bookmarkStart w:id="423" w:name="güvenlik-denetim-ve-uyumluluk"/>
+      <w:bookmarkEnd w:id="419"/>
       <w:r>
         <w:rPr>
           <w:rFonts w:eastAsia="Arial"/>
@@ -22709,7 +22715,7 @@
           <w:lang w:val="tr-TR"/>
         </w:rPr>
       </w:pPr>
-      <w:commentRangeStart w:id="420"/>
+      <w:commentRangeStart w:id="424"/>
       <w:r>
         <w:rPr>
           <w:rFonts w:ascii="Arial" w:eastAsia="Arial" w:hAnsi="Arial" w:cs="Arial"/>
@@ -22719,7 +22725,7 @@
         </w:rPr>
         <w:t>Backend API (Spring Boot)</w:t>
       </w:r>
-      <w:commentRangeEnd w:id="420"/>
+      <w:commentRangeEnd w:id="424"/>
       <w:r>
         <w:rPr>
           <w:rStyle w:val="AklamaBavurusu"/>
@@ -22728,7 +22734,7 @@
           <w:szCs w:val="20"/>
           <w:lang w:val="tr-TR"/>
         </w:rPr>
-        <w:commentReference w:id="420"/>
+        <w:commentReference w:id="424"/>
       </w:r>
       <w:r>
         <w:rPr>
@@ -24132,7 +24138,7 @@
               </w:rPr>
               <w:t xml:space="preserve">case_id, </w:t>
             </w:r>
-            <w:del w:id="421" w:author="Toygun Baysal" w:date="2026-03-10T15:54:00Z" w16du:dateUtc="2026-03-10T12:54:00Z">
+            <w:del w:id="425" w:author="Toygun Baysal" w:date="2026-03-10T15:54:00Z" w16du:dateUtc="2026-03-10T12:54:00Z">
               <w:r>
                 <w:rPr>
                   <w:rFonts w:ascii="Arial" w:eastAsia="Arial" w:hAnsi="Arial" w:cs="Arial"/>
@@ -25311,7 +25317,7 @@
               </w:rPr>
               <w:t xml:space="preserve">target_user_id, role, </w:t>
             </w:r>
-            <w:del w:id="422" w:author="Toygun Baysal" w:date="2026-03-10T15:55:00Z" w16du:dateUtc="2026-03-10T12:55:00Z">
+            <w:del w:id="426" w:author="Toygun Baysal" w:date="2026-03-10T15:55:00Z" w16du:dateUtc="2026-03-10T12:55:00Z">
               <w:r>
                 <w:rPr>
                   <w:rFonts w:ascii="Arial" w:eastAsia="Arial" w:hAnsi="Arial" w:cs="Arial"/>
@@ -27360,7 +27366,7 @@
               </w:rPr>
               <w:t xml:space="preserve">target_user_id, old_role, new_role, </w:t>
             </w:r>
-            <w:del w:id="423" w:author="Toygun Baysal" w:date="2026-03-10T15:55:00Z" w16du:dateUtc="2026-03-10T12:55:00Z">
+            <w:del w:id="427" w:author="Toygun Baysal" w:date="2026-03-10T15:55:00Z" w16du:dateUtc="2026-03-10T12:55:00Z">
               <w:r>
                 <w:rPr>
                   <w:rFonts w:ascii="Arial" w:eastAsia="Arial" w:hAnsi="Arial" w:cs="Arial"/>
@@ -28407,18 +28413,18 @@
           <w:lang w:val="tr-TR"/>
         </w:rPr>
       </w:pPr>
-      <w:bookmarkStart w:id="424" w:name="X51dbdc5946104dc6f1c50d59a60882f74a903a5"/>
-      <w:bookmarkEnd w:id="419"/>
-    </w:p>
-    <w:p>
-      <w:pPr>
-        <w:rPr>
-          <w:lang w:val="tr-TR"/>
-        </w:rPr>
-      </w:pPr>
-      <w:bookmarkStart w:id="425" w:name="section"/>
-      <w:bookmarkEnd w:id="424"/>
-      <w:bookmarkEnd w:id="425"/>
+      <w:bookmarkStart w:id="428" w:name="X51dbdc5946104dc6f1c50d59a60882f74a903a5"/>
+      <w:bookmarkEnd w:id="423"/>
+    </w:p>
+    <w:p>
+      <w:pPr>
+        <w:rPr>
+          <w:lang w:val="tr-TR"/>
+        </w:rPr>
+      </w:pPr>
+      <w:bookmarkStart w:id="429" w:name="section"/>
+      <w:bookmarkEnd w:id="428"/>
+      <w:bookmarkEnd w:id="429"/>
     </w:p>
     <w:sectPr>
       <w:pgSz w:w="12240" w:h="15840"/>
@@ -29526,7 +29532,7 @@
       </w:r>
     </w:p>
   </w:comment>
-  <w:comment w:id="393" w:author="Tamer Sezgin" w:date="2026-03-10T16:34:00Z" w:initials="TS">
+  <w:comment w:id="397" w:author="Tamer Sezgin" w:date="2026-03-10T16:34:00Z" w:initials="TS">
     <w:p>
       <w:pPr>
         <w:pStyle w:val="AklamaMetni"/>
@@ -29566,7 +29572,7 @@
       </w:r>
     </w:p>
   </w:comment>
-  <w:comment w:id="394" w:author="Toygun Baysal" w:date="2026-03-11T15:48:00Z" w:initials="tb">
+  <w:comment w:id="398" w:author="Toygun Baysal" w:date="2026-03-11T15:48:00Z" w:initials="tb">
     <w:p>
       <w:pPr>
         <w:pStyle w:val="AklamaMetni"/>
@@ -29583,7 +29589,7 @@
       </w:r>
     </w:p>
   </w:comment>
-  <w:comment w:id="395" w:author="Tamer Sezgin" w:date="2026-03-10T16:32:00Z" w:initials="TS">
+  <w:comment w:id="399" w:author="Tamer Sezgin" w:date="2026-03-10T16:32:00Z" w:initials="TS">
     <w:p>
       <w:pPr>
         <w:pStyle w:val="AklamaMetni"/>
@@ -29599,7 +29605,7 @@
       </w:r>
     </w:p>
   </w:comment>
-  <w:comment w:id="397" w:author="Tamer Sezgin" w:date="2026-03-10T17:06:00Z" w:initials="TS">
+  <w:comment w:id="401" w:author="Tamer Sezgin" w:date="2026-03-10T17:06:00Z" w:initials="TS">
     <w:p>
       <w:pPr>
         <w:pStyle w:val="AklamaMetni"/>
@@ -29636,7 +29642,7 @@
       </w:r>
     </w:p>
   </w:comment>
-  <w:comment w:id="398" w:author="Toygun Baysal" w:date="2026-03-11T15:49:00Z" w:initials="tb">
+  <w:comment w:id="402" w:author="Toygun Baysal" w:date="2026-03-11T15:49:00Z" w:initials="tb">
     <w:p>
       <w:pPr>
         <w:pStyle w:val="AklamaMetni"/>
@@ -29653,7 +29659,7 @@
       </w:r>
     </w:p>
   </w:comment>
-  <w:comment w:id="401" w:author="Toygun Baysal" w:date="2026-03-10T16:24:00Z" w:initials="tb">
+  <w:comment w:id="405" w:author="Toygun Baysal" w:date="2026-03-10T16:24:00Z" w:initials="tb">
     <w:p>
       <w:pPr>
         <w:pStyle w:val="AklamaMetni"/>
@@ -29670,7 +29676,7 @@
       </w:r>
     </w:p>
   </w:comment>
-  <w:comment w:id="403" w:author="Toygun Baysal" w:date="2026-03-10T16:23:00Z" w:initials="tb">
+  <w:comment w:id="407" w:author="Toygun Baysal" w:date="2026-03-10T16:23:00Z" w:initials="tb">
     <w:p>
       <w:pPr>
         <w:pStyle w:val="AklamaMetni"/>
@@ -29687,7 +29693,7 @@
       </w:r>
     </w:p>
   </w:comment>
-  <w:comment w:id="404" w:author="Toygun Baysal" w:date="2026-03-10T16:23:00Z" w:initials="tb">
+  <w:comment w:id="408" w:author="Toygun Baysal" w:date="2026-03-10T16:23:00Z" w:initials="tb">
     <w:p>
       <w:pPr>
         <w:pStyle w:val="AklamaMetni"/>
@@ -29704,7 +29710,7 @@
       </w:r>
     </w:p>
   </w:comment>
-  <w:comment w:id="418" w:author="Toygun Baysal" w:date="2026-03-05T15:16:00Z" w:initials="tb">
+  <w:comment w:id="422" w:author="Toygun Baysal" w:date="2026-03-05T15:16:00Z" w:initials="tb">
     <w:p>
       <w:pPr>
         <w:jc w:val="left"/>
@@ -29720,7 +29726,7 @@
       </w:r>
     </w:p>
   </w:comment>
-  <w:comment w:id="420" w:author="Tamer Sezgin" w:date="2026-03-10T19:24:00Z" w:initials="TS">
+  <w:comment w:id="424" w:author="Tamer Sezgin" w:date="2026-03-10T19:24:00Z" w:initials="TS">
     <w:p>
       <w:pPr>
         <w:pStyle w:val="AklamaMetni"/>

</xml_diff>